<commit_message>
Make LocalConnect the featured project, move Ennie Estate to a regular listing
- Swap the featured project block on the home page and projects page from
  Ennie Garden Estate Platform to LocalConnect, moving Ennie into the
  regular project grid/resume listing
- Reorder the resume so LocalConnect leads as the featured project
- Add LocalConnect as the first project entry in the downloadable resume
  docx, with working hyperlinks for the live demo and GitHub
</commit_message>
<xml_diff>
--- a/Rachael_Owolabi_Resume_Software_developer.docx
+++ b/Rachael_Owolabi_Resume_Software_developer.docx
@@ -565,6 +565,118 @@
           <w:szCs w:val="24"/>
         </w:rPr>
         <w:t>Projects</w:t>
+      </w:r>
+    </w:p>
+    <w:p>
+      <w:pPr>
+        <w:spacing w:before="120"/>
+      </w:pPr>
+      <w:r>
+        <w:rPr>
+          <w:rFonts w:ascii="Arial" w:eastAsia="Arial" w:hAnsi="Arial" w:cs="Arial"/>
+          <w:b/>
+          <w:bCs/>
+          <w:color w:val="000000"/>
+          <w:sz w:val="22"/>
+          <w:szCs w:val="22"/>
+        </w:rPr>
+        <w:t xml:space="preserve">LocalConnect</w:t>
+      </w:r>
+      <w:r>
+        <w:rPr>
+          <w:rFonts w:ascii="Arial" w:eastAsia="Arial" w:hAnsi="Arial" w:cs="Arial"/>
+          <w:color w:val="000000"/>
+        </w:rPr>
+        <w:t xml:space="preserve">  |</w:t>
+      </w:r>
+      <w:r>
+        <w:rPr>
+          <w:rFonts w:ascii="Arial" w:eastAsia="Arial" w:hAnsi="Arial" w:cs="Arial"/>
+          <w:color w:val="000000"/>
+        </w:rPr>
+        <w:t xml:space="preserve">  Supabase | Stripe | JavaScript  </w:t>
+      </w:r>
+      <w:hyperlink r:id="rId10" w:history="1">
+        <w:proofErr w:type="spellStart"/>
+        <w:r>
+          <w:rPr>
+            <w:rFonts w:ascii="Arial" w:eastAsia="Arial" w:hAnsi="Arial" w:cs="Arial"/>
+            <w:color w:val="2E75B6"/>
+            <w:u w:val="single"/>
+          </w:rPr>
+          <w:t>Live demo</w:t>
+        </w:r>
+        <w:proofErr w:type="spellEnd"/>
+      </w:hyperlink>
+      <w:r>
+        <w:rPr>
+          <w:rFonts w:ascii="Arial" w:eastAsia="Arial" w:hAnsi="Arial" w:cs="Arial"/>
+          <w:color w:val="000000"/>
+        </w:rPr>
+        <w:t xml:space="preserve"> | </w:t>
+      </w:r>
+      <w:hyperlink r:id="rId11" w:history="1">
+        <w:proofErr w:type="spellStart"/>
+        <w:r>
+          <w:rPr>
+            <w:rFonts w:ascii="Arial" w:eastAsia="Arial" w:hAnsi="Arial" w:cs="Arial"/>
+            <w:color w:val="2E75B6"/>
+            <w:u w:val="single"/>
+          </w:rPr>
+          <w:t>Github</w:t>
+        </w:r>
+        <w:proofErr w:type="spellEnd"/>
+      </w:hyperlink>
+    </w:p>
+    <w:p>
+      <w:pPr>
+        <w:pStyle w:val="ListParagraph"/>
+        <w:numPr>
+          <w:ilvl w:val="0"/>
+          <w:numId w:val="2"/>
+        </w:numPr>
+        <w:spacing w:before="40" w:after="40"/>
+      </w:pPr>
+      <w:r>
+        <w:rPr>
+          <w:rFonts w:ascii="Arial" w:eastAsia="Arial" w:hAnsi="Arial" w:cs="Arial"/>
+          <w:color w:val="000000"/>
+        </w:rPr>
+        <w:t xml:space="preserve">Built a local services marketplace with a client booking flow and separate customer, provider, and admin dashboards.</w:t>
+      </w:r>
+    </w:p>
+    <w:p>
+      <w:pPr>
+        <w:pStyle w:val="ListParagraph"/>
+        <w:numPr>
+          <w:ilvl w:val="0"/>
+          <w:numId w:val="2"/>
+        </w:numPr>
+        <w:spacing w:before="40" w:after="40"/>
+      </w:pPr>
+      <w:r>
+        <w:rPr>
+          <w:rFonts w:ascii="Arial" w:eastAsia="Arial" w:hAnsi="Arial" w:cs="Arial"/>
+          <w:color w:val="000000"/>
+        </w:rPr>
+        <w:t xml:space="preserve">Integrated Supabase for authentication, database, and role-based access via row-level security, and Stripe for booking payments and provider subscription billing.</w:t>
+      </w:r>
+    </w:p>
+    <w:p>
+      <w:pPr>
+        <w:pStyle w:val="ListParagraph"/>
+        <w:numPr>
+          <w:ilvl w:val="0"/>
+          <w:numId w:val="2"/>
+        </w:numPr>
+        <w:spacing w:before="40" w:after="40"/>
+      </w:pPr>
+      <w:r>
+        <w:rPr>
+          <w:rFonts w:ascii="Arial" w:eastAsia="Arial" w:hAnsi="Arial" w:cs="Arial"/>
+          <w:color w:val="000000"/>
+        </w:rPr>
+        <w:t xml:space="preserve">Wrote server-side Supabase Edge Functions to handle Stripe checkout, billing portal, and webhook events.</w:t>
       </w:r>
     </w:p>
     <w:p>

</xml_diff>